<commit_message>
Update resume in portfolio
</commit_message>
<xml_diff>
--- a/Sumit_Kamble_Resume.docx
+++ b/Sumit_Kamble_Resume.docx
@@ -6,10 +6,13 @@
       <w:pPr>
         <w:spacing w:after="40"/>
         <w:jc w:val="center"/>
-      </w:pPr>
-      <w:r>
-        <w:rPr>
-          <w:rFonts w:ascii="Calibri" w:eastAsia="Calibri" w:hAnsi="Calibri" w:cs="Calibri"/>
+        <w:rPr>
+          <w:rFonts w:asciiTheme="minorHAnsi" w:hAnsiTheme="minorHAnsi" w:cstheme="minorHAnsi"/>
+        </w:rPr>
+      </w:pPr>
+      <w:r>
+        <w:rPr>
+          <w:rFonts w:asciiTheme="minorHAnsi" w:eastAsia="Calibri" w:hAnsiTheme="minorHAnsi" w:cstheme="minorHAnsi"/>
           <w:b/>
           <w:bCs/>
           <w:color w:val="1F3864"/>
@@ -23,10 +26,13 @@
       <w:pPr>
         <w:spacing w:after="120"/>
         <w:jc w:val="center"/>
-      </w:pPr>
-      <w:r>
-        <w:rPr>
-          <w:rFonts w:ascii="Calibri" w:eastAsia="Calibri" w:hAnsi="Calibri" w:cs="Calibri"/>
+        <w:rPr>
+          <w:rFonts w:asciiTheme="minorHAnsi" w:hAnsiTheme="minorHAnsi" w:cstheme="minorHAnsi"/>
+        </w:rPr>
+      </w:pPr>
+      <w:r>
+        <w:rPr>
+          <w:rFonts w:asciiTheme="minorHAnsi" w:eastAsia="Calibri" w:hAnsiTheme="minorHAnsi" w:cstheme="minorHAnsi"/>
           <w:b/>
           <w:bCs/>
           <w:color w:val="222222"/>
@@ -38,7 +44,7 @@
       <w:proofErr w:type="spellStart"/>
       <w:r>
         <w:rPr>
-          <w:rFonts w:ascii="Calibri" w:eastAsia="Calibri" w:hAnsi="Calibri" w:cs="Calibri"/>
+          <w:rFonts w:asciiTheme="minorHAnsi" w:eastAsia="Calibri" w:hAnsiTheme="minorHAnsi" w:cstheme="minorHAnsi"/>
           <w:b/>
           <w:bCs/>
           <w:color w:val="222222"/>
@@ -50,7 +56,7 @@
       <w:proofErr w:type="spellEnd"/>
       <w:r>
         <w:rPr>
-          <w:rFonts w:ascii="Calibri" w:eastAsia="Calibri" w:hAnsi="Calibri" w:cs="Calibri"/>
+          <w:rFonts w:asciiTheme="minorHAnsi" w:eastAsia="Calibri" w:hAnsiTheme="minorHAnsi" w:cstheme="minorHAnsi"/>
           <w:b/>
           <w:bCs/>
           <w:color w:val="222222"/>
@@ -68,14 +74,14 @@
         <w:spacing w:after="200"/>
         <w:jc w:val="center"/>
         <w:rPr>
-          <w:rFonts w:ascii="Calibri" w:eastAsia="Calibri" w:hAnsi="Calibri" w:cs="Calibri"/>
+          <w:rFonts w:asciiTheme="minorHAnsi" w:eastAsia="Calibri" w:hAnsiTheme="minorHAnsi" w:cstheme="minorHAnsi"/>
           <w:color w:val="555555"/>
         </w:rPr>
       </w:pPr>
       <w:proofErr w:type="spellStart"/>
       <w:r>
         <w:rPr>
-          <w:rFonts w:ascii="Calibri" w:eastAsia="Calibri" w:hAnsi="Calibri" w:cs="Calibri"/>
+          <w:rFonts w:asciiTheme="minorHAnsi" w:eastAsia="Calibri" w:hAnsiTheme="minorHAnsi" w:cstheme="minorHAnsi"/>
           <w:color w:val="555555"/>
         </w:rPr>
         <w:t>Pune</w:t>
@@ -83,21 +89,21 @@
       <w:proofErr w:type="spellEnd"/>
       <w:r>
         <w:rPr>
-          <w:rFonts w:ascii="Calibri" w:eastAsia="Calibri" w:hAnsi="Calibri" w:cs="Calibri"/>
+          <w:rFonts w:asciiTheme="minorHAnsi" w:eastAsia="Calibri" w:hAnsiTheme="minorHAnsi" w:cstheme="minorHAnsi"/>
           <w:color w:val="555555"/>
         </w:rPr>
         <w:t>, Maharashtra   |   sumitkamble5550@gm</w:t>
       </w:r>
       <w:r>
         <w:rPr>
-          <w:rFonts w:ascii="Calibri" w:eastAsia="Calibri" w:hAnsi="Calibri" w:cs="Calibri"/>
+          <w:rFonts w:asciiTheme="minorHAnsi" w:eastAsia="Calibri" w:hAnsiTheme="minorHAnsi" w:cstheme="minorHAnsi"/>
           <w:color w:val="555555"/>
         </w:rPr>
         <w:t>ail.com   |   [9112275550</w:t>
       </w:r>
       <w:r>
         <w:rPr>
-          <w:rFonts w:ascii="Calibri" w:eastAsia="Calibri" w:hAnsi="Calibri" w:cs="Calibri"/>
+          <w:rFonts w:asciiTheme="minorHAnsi" w:eastAsia="Calibri" w:hAnsiTheme="minorHAnsi" w:cstheme="minorHAnsi"/>
           <w:color w:val="555555"/>
         </w:rPr>
         <w:t xml:space="preserve">]   |   linkedin.com/in/sumit-kamble-a6a3b5405   </w:t>
@@ -111,27 +117,20 @@
         <w:spacing w:after="200"/>
         <w:jc w:val="center"/>
         <w:rPr>
-          <w:rFonts w:ascii="Calibri" w:eastAsia="Calibri" w:hAnsi="Calibri" w:cs="Calibri"/>
+          <w:rFonts w:asciiTheme="minorHAnsi" w:eastAsia="Calibri" w:hAnsiTheme="minorHAnsi" w:cstheme="minorHAnsi"/>
           <w:color w:val="555555"/>
         </w:rPr>
       </w:pPr>
       <w:r>
         <w:rPr>
-          <w:rFonts w:ascii="Calibri" w:eastAsia="Calibri" w:hAnsi="Calibri" w:cs="Calibri"/>
+          <w:rFonts w:asciiTheme="minorHAnsi" w:eastAsia="Calibri" w:hAnsiTheme="minorHAnsi" w:cstheme="minorHAnsi"/>
           <w:color w:val="555555"/>
         </w:rPr>
-        <w:t>|   [</w:t>
-      </w:r>
-      <w:r>
-        <w:rPr>
-          <w:rFonts w:ascii="Calibri" w:eastAsia="Calibri" w:hAnsi="Calibri" w:cs="Calibri"/>
-          <w:color w:val="555555"/>
-        </w:rPr>
-        <w:t>https://github.com/sumitk-Cloud/</w:t>
-      </w:r>
-      <w:r>
-        <w:rPr>
-          <w:rFonts w:ascii="Calibri" w:eastAsia="Calibri" w:hAnsi="Calibri" w:cs="Calibri"/>
+        <w:t>|   [https://github.com/sumitk-Cloud/</w:t>
+      </w:r>
+      <w:r>
+        <w:rPr>
+          <w:rFonts w:asciiTheme="minorHAnsi" w:eastAsia="Calibri" w:hAnsiTheme="minorHAnsi" w:cstheme="minorHAnsi"/>
           <w:color w:val="555555"/>
         </w:rPr>
         <w:t>]</w:t>
@@ -143,10 +142,13 @@
           <w:bottom w:val="single" w:sz="6" w:space="2" w:color="1F3864"/>
         </w:pBdr>
         <w:spacing w:before="260" w:after="100"/>
-      </w:pPr>
-      <w:r>
-        <w:rPr>
-          <w:rFonts w:ascii="Calibri" w:eastAsia="Calibri" w:hAnsi="Calibri" w:cs="Calibri"/>
+        <w:rPr>
+          <w:rFonts w:asciiTheme="minorHAnsi" w:hAnsiTheme="minorHAnsi" w:cstheme="minorHAnsi"/>
+        </w:rPr>
+      </w:pPr>
+      <w:r>
+        <w:rPr>
+          <w:rFonts w:asciiTheme="minorHAnsi" w:eastAsia="Calibri" w:hAnsiTheme="minorHAnsi" w:cstheme="minorHAnsi"/>
           <w:b/>
           <w:bCs/>
           <w:color w:val="1F3864"/>
@@ -159,11 +161,14 @@
     <w:p>
       <w:pPr>
         <w:spacing w:after="100"/>
+        <w:rPr>
+          <w:rFonts w:asciiTheme="minorHAnsi" w:hAnsiTheme="minorHAnsi" w:cstheme="minorHAnsi"/>
+        </w:rPr>
       </w:pPr>
       <w:proofErr w:type="gramStart"/>
       <w:r>
         <w:rPr>
-          <w:rFonts w:ascii="Calibri" w:eastAsia="Calibri" w:hAnsi="Calibri" w:cs="Calibri"/>
+          <w:rFonts w:asciiTheme="minorHAnsi" w:eastAsia="Calibri" w:hAnsiTheme="minorHAnsi" w:cstheme="minorHAnsi"/>
           <w:color w:val="222222"/>
           <w:sz w:val="21"/>
           <w:szCs w:val="21"/>
@@ -173,7 +178,7 @@
       <w:proofErr w:type="spellStart"/>
       <w:r>
         <w:rPr>
-          <w:rFonts w:ascii="Calibri" w:eastAsia="Calibri" w:hAnsi="Calibri" w:cs="Calibri"/>
+          <w:rFonts w:asciiTheme="minorHAnsi" w:eastAsia="Calibri" w:hAnsiTheme="minorHAnsi" w:cstheme="minorHAnsi"/>
           <w:color w:val="222222"/>
           <w:sz w:val="21"/>
           <w:szCs w:val="21"/>
@@ -183,7 +188,7 @@
       <w:proofErr w:type="spellEnd"/>
       <w:r>
         <w:rPr>
-          <w:rFonts w:ascii="Calibri" w:eastAsia="Calibri" w:hAnsi="Calibri" w:cs="Calibri"/>
+          <w:rFonts w:asciiTheme="minorHAnsi" w:eastAsia="Calibri" w:hAnsiTheme="minorHAnsi" w:cstheme="minorHAnsi"/>
           <w:color w:val="222222"/>
           <w:sz w:val="21"/>
           <w:szCs w:val="21"/>
@@ -192,7 +197,7 @@
       </w:r>
       <w:r>
         <w:rPr>
-          <w:rFonts w:ascii="Calibri" w:eastAsia="Calibri" w:hAnsi="Calibri" w:cs="Calibri"/>
+          <w:rFonts w:asciiTheme="minorHAnsi" w:eastAsia="Calibri" w:hAnsiTheme="minorHAnsi" w:cstheme="minorHAnsi"/>
           <w:color w:val="222222"/>
           <w:sz w:val="21"/>
           <w:szCs w:val="21"/>
@@ -201,7 +206,7 @@
       </w:r>
       <w:r>
         <w:rPr>
-          <w:rFonts w:ascii="Calibri" w:eastAsia="Calibri" w:hAnsi="Calibri" w:cs="Calibri"/>
+          <w:rFonts w:asciiTheme="minorHAnsi" w:eastAsia="Calibri" w:hAnsiTheme="minorHAnsi" w:cstheme="minorHAnsi"/>
           <w:color w:val="222222"/>
           <w:sz w:val="21"/>
           <w:szCs w:val="21"/>
@@ -211,7 +216,7 @@
       <w:proofErr w:type="gramEnd"/>
       <w:r>
         <w:rPr>
-          <w:rFonts w:ascii="Calibri" w:eastAsia="Calibri" w:hAnsi="Calibri" w:cs="Calibri"/>
+          <w:rFonts w:asciiTheme="minorHAnsi" w:eastAsia="Calibri" w:hAnsiTheme="minorHAnsi" w:cstheme="minorHAnsi"/>
           <w:color w:val="222222"/>
           <w:sz w:val="21"/>
           <w:szCs w:val="21"/>
@@ -221,7 +226,7 @@
       <w:proofErr w:type="gramStart"/>
       <w:r>
         <w:rPr>
-          <w:rFonts w:ascii="Calibri" w:eastAsia="Calibri" w:hAnsi="Calibri" w:cs="Calibri"/>
+          <w:rFonts w:asciiTheme="minorHAnsi" w:eastAsia="Calibri" w:hAnsiTheme="minorHAnsi" w:cstheme="minorHAnsi"/>
           <w:color w:val="222222"/>
           <w:sz w:val="21"/>
           <w:szCs w:val="21"/>
@@ -231,7 +236,7 @@
       <w:proofErr w:type="gramEnd"/>
       <w:r>
         <w:rPr>
-          <w:rFonts w:ascii="Calibri" w:eastAsia="Calibri" w:hAnsi="Calibri" w:cs="Calibri"/>
+          <w:rFonts w:asciiTheme="minorHAnsi" w:eastAsia="Calibri" w:hAnsiTheme="minorHAnsi" w:cstheme="minorHAnsi"/>
           <w:color w:val="222222"/>
           <w:sz w:val="21"/>
           <w:szCs w:val="21"/>
@@ -241,7 +246,7 @@
       <w:proofErr w:type="gramStart"/>
       <w:r>
         <w:rPr>
-          <w:rFonts w:ascii="Calibri" w:eastAsia="Calibri" w:hAnsi="Calibri" w:cs="Calibri"/>
+          <w:rFonts w:asciiTheme="minorHAnsi" w:eastAsia="Calibri" w:hAnsiTheme="minorHAnsi" w:cstheme="minorHAnsi"/>
           <w:color w:val="222222"/>
           <w:sz w:val="21"/>
           <w:szCs w:val="21"/>
@@ -256,10 +261,13 @@
           <w:bottom w:val="single" w:sz="6" w:space="2" w:color="1F3864"/>
         </w:pBdr>
         <w:spacing w:before="260" w:after="100"/>
-      </w:pPr>
-      <w:r>
-        <w:rPr>
-          <w:rFonts w:ascii="Calibri" w:eastAsia="Calibri" w:hAnsi="Calibri" w:cs="Calibri"/>
+        <w:rPr>
+          <w:rFonts w:asciiTheme="minorHAnsi" w:hAnsiTheme="minorHAnsi" w:cstheme="minorHAnsi"/>
+        </w:rPr>
+      </w:pPr>
+      <w:r>
+        <w:rPr>
+          <w:rFonts w:asciiTheme="minorHAnsi" w:eastAsia="Calibri" w:hAnsiTheme="minorHAnsi" w:cstheme="minorHAnsi"/>
           <w:b/>
           <w:bCs/>
           <w:color w:val="1F3864"/>
@@ -277,10 +285,13 @@
           <w:numId w:val="2"/>
         </w:numPr>
         <w:spacing w:after="60"/>
-      </w:pPr>
-      <w:r>
-        <w:rPr>
-          <w:rFonts w:ascii="Calibri" w:eastAsia="Calibri" w:hAnsi="Calibri" w:cs="Calibri"/>
+        <w:rPr>
+          <w:rFonts w:asciiTheme="minorHAnsi" w:hAnsiTheme="minorHAnsi" w:cstheme="minorHAnsi"/>
+        </w:rPr>
+      </w:pPr>
+      <w:r>
+        <w:rPr>
+          <w:rFonts w:asciiTheme="minorHAnsi" w:eastAsia="Calibri" w:hAnsiTheme="minorHAnsi" w:cstheme="minorHAnsi"/>
           <w:color w:val="222222"/>
           <w:sz w:val="21"/>
           <w:szCs w:val="21"/>
@@ -296,10 +307,13 @@
           <w:numId w:val="2"/>
         </w:numPr>
         <w:spacing w:after="60"/>
-      </w:pPr>
-      <w:r>
-        <w:rPr>
-          <w:rFonts w:ascii="Calibri" w:eastAsia="Calibri" w:hAnsi="Calibri" w:cs="Calibri"/>
+        <w:rPr>
+          <w:rFonts w:asciiTheme="minorHAnsi" w:hAnsiTheme="minorHAnsi" w:cstheme="minorHAnsi"/>
+        </w:rPr>
+      </w:pPr>
+      <w:r>
+        <w:rPr>
+          <w:rFonts w:asciiTheme="minorHAnsi" w:eastAsia="Calibri" w:hAnsiTheme="minorHAnsi" w:cstheme="minorHAnsi"/>
           <w:color w:val="222222"/>
           <w:sz w:val="21"/>
           <w:szCs w:val="21"/>
@@ -309,7 +323,7 @@
       <w:proofErr w:type="spellStart"/>
       <w:r>
         <w:rPr>
-          <w:rFonts w:ascii="Calibri" w:eastAsia="Calibri" w:hAnsi="Calibri" w:cs="Calibri"/>
+          <w:rFonts w:asciiTheme="minorHAnsi" w:eastAsia="Calibri" w:hAnsiTheme="minorHAnsi" w:cstheme="minorHAnsi"/>
           <w:color w:val="222222"/>
           <w:sz w:val="21"/>
           <w:szCs w:val="21"/>
@@ -319,7 +333,7 @@
       <w:proofErr w:type="spellEnd"/>
       <w:r>
         <w:rPr>
-          <w:rFonts w:ascii="Calibri" w:eastAsia="Calibri" w:hAnsi="Calibri" w:cs="Calibri"/>
+          <w:rFonts w:asciiTheme="minorHAnsi" w:eastAsia="Calibri" w:hAnsiTheme="minorHAnsi" w:cstheme="minorHAnsi"/>
           <w:color w:val="222222"/>
           <w:sz w:val="21"/>
           <w:szCs w:val="21"/>
@@ -329,7 +343,7 @@
       <w:proofErr w:type="spellStart"/>
       <w:r>
         <w:rPr>
-          <w:rFonts w:ascii="Calibri" w:eastAsia="Calibri" w:hAnsi="Calibri" w:cs="Calibri"/>
+          <w:rFonts w:asciiTheme="minorHAnsi" w:eastAsia="Calibri" w:hAnsiTheme="minorHAnsi" w:cstheme="minorHAnsi"/>
           <w:color w:val="222222"/>
           <w:sz w:val="21"/>
           <w:szCs w:val="21"/>
@@ -346,16 +360,39 @@
           <w:numId w:val="2"/>
         </w:numPr>
         <w:spacing w:after="60"/>
-      </w:pPr>
-      <w:r>
-        <w:rPr>
-          <w:rFonts w:ascii="Calibri" w:eastAsia="Calibri" w:hAnsi="Calibri" w:cs="Calibri"/>
-          <w:color w:val="222222"/>
-          <w:sz w:val="21"/>
-          <w:szCs w:val="21"/>
-        </w:rPr>
-        <w:t>CI/CD Tools: Jenkins</w:t>
-      </w:r>
+        <w:rPr>
+          <w:rFonts w:asciiTheme="minorHAnsi" w:hAnsiTheme="minorHAnsi" w:cstheme="minorHAnsi"/>
+        </w:rPr>
+      </w:pPr>
+      <w:r>
+        <w:rPr>
+          <w:rFonts w:asciiTheme="minorHAnsi" w:eastAsia="Calibri" w:hAnsiTheme="minorHAnsi" w:cstheme="minorHAnsi"/>
+          <w:color w:val="222222"/>
+          <w:sz w:val="21"/>
+          <w:szCs w:val="21"/>
+        </w:rPr>
+        <w:t xml:space="preserve">CI/CD Tools: </w:t>
+      </w:r>
+      <w:proofErr w:type="spellStart"/>
+      <w:r>
+        <w:rPr>
+          <w:rFonts w:asciiTheme="minorHAnsi" w:eastAsia="Calibri" w:hAnsiTheme="minorHAnsi" w:cstheme="minorHAnsi"/>
+          <w:color w:val="222222"/>
+          <w:sz w:val="21"/>
+          <w:szCs w:val="21"/>
+        </w:rPr>
+        <w:t>Jenkins</w:t>
+      </w:r>
+      <w:r>
+        <w:rPr>
+          <w:rFonts w:asciiTheme="minorHAnsi" w:eastAsia="Calibri" w:hAnsiTheme="minorHAnsi" w:cstheme="minorHAnsi"/>
+          <w:color w:val="222222"/>
+          <w:sz w:val="21"/>
+          <w:szCs w:val="21"/>
+        </w:rPr>
+        <w:t>,GitActions</w:t>
+      </w:r>
+      <w:proofErr w:type="spellEnd"/>
     </w:p>
     <w:p>
       <w:pPr>
@@ -365,10 +402,13 @@
           <w:numId w:val="2"/>
         </w:numPr>
         <w:spacing w:after="60"/>
-      </w:pPr>
-      <w:r>
-        <w:rPr>
-          <w:rFonts w:ascii="Calibri" w:eastAsia="Calibri" w:hAnsi="Calibri" w:cs="Calibri"/>
+        <w:rPr>
+          <w:rFonts w:asciiTheme="minorHAnsi" w:hAnsiTheme="minorHAnsi" w:cstheme="minorHAnsi"/>
+        </w:rPr>
+      </w:pPr>
+      <w:r>
+        <w:rPr>
+          <w:rFonts w:asciiTheme="minorHAnsi" w:eastAsia="Calibri" w:hAnsiTheme="minorHAnsi" w:cstheme="minorHAnsi"/>
           <w:color w:val="222222"/>
           <w:sz w:val="21"/>
           <w:szCs w:val="21"/>
@@ -378,7 +418,7 @@
       <w:proofErr w:type="spellStart"/>
       <w:r>
         <w:rPr>
-          <w:rFonts w:ascii="Calibri" w:eastAsia="Calibri" w:hAnsi="Calibri" w:cs="Calibri"/>
+          <w:rFonts w:asciiTheme="minorHAnsi" w:eastAsia="Calibri" w:hAnsiTheme="minorHAnsi" w:cstheme="minorHAnsi"/>
           <w:color w:val="222222"/>
           <w:sz w:val="21"/>
           <w:szCs w:val="21"/>
@@ -395,10 +435,13 @@
           <w:numId w:val="2"/>
         </w:numPr>
         <w:spacing w:after="60"/>
-      </w:pPr>
-      <w:r>
-        <w:rPr>
-          <w:rFonts w:ascii="Calibri" w:eastAsia="Calibri" w:hAnsi="Calibri" w:cs="Calibri"/>
+        <w:rPr>
+          <w:rFonts w:asciiTheme="minorHAnsi" w:hAnsiTheme="minorHAnsi" w:cstheme="minorHAnsi"/>
+        </w:rPr>
+      </w:pPr>
+      <w:r>
+        <w:rPr>
+          <w:rFonts w:asciiTheme="minorHAnsi" w:eastAsia="Calibri" w:hAnsiTheme="minorHAnsi" w:cstheme="minorHAnsi"/>
           <w:color w:val="222222"/>
           <w:sz w:val="21"/>
           <w:szCs w:val="21"/>
@@ -408,7 +451,7 @@
       <w:proofErr w:type="spellStart"/>
       <w:r>
         <w:rPr>
-          <w:rFonts w:ascii="Calibri" w:eastAsia="Calibri" w:hAnsi="Calibri" w:cs="Calibri"/>
+          <w:rFonts w:asciiTheme="minorHAnsi" w:eastAsia="Calibri" w:hAnsiTheme="minorHAnsi" w:cstheme="minorHAnsi"/>
           <w:color w:val="222222"/>
           <w:sz w:val="21"/>
           <w:szCs w:val="21"/>
@@ -417,7 +460,7 @@
       </w:r>
       <w:r>
         <w:rPr>
-          <w:rFonts w:ascii="Calibri" w:eastAsia="Calibri" w:hAnsi="Calibri" w:cs="Calibri"/>
+          <w:rFonts w:asciiTheme="minorHAnsi" w:eastAsia="Calibri" w:hAnsiTheme="minorHAnsi" w:cstheme="minorHAnsi"/>
           <w:color w:val="222222"/>
           <w:sz w:val="21"/>
           <w:szCs w:val="21"/>
@@ -434,10 +477,13 @@
           <w:numId w:val="2"/>
         </w:numPr>
         <w:spacing w:after="60"/>
-      </w:pPr>
-      <w:r>
-        <w:rPr>
-          <w:rFonts w:ascii="Calibri" w:eastAsia="Calibri" w:hAnsi="Calibri" w:cs="Calibri"/>
+        <w:rPr>
+          <w:rFonts w:asciiTheme="minorHAnsi" w:hAnsiTheme="minorHAnsi" w:cstheme="minorHAnsi"/>
+        </w:rPr>
+      </w:pPr>
+      <w:r>
+        <w:rPr>
+          <w:rFonts w:asciiTheme="minorHAnsi" w:eastAsia="Calibri" w:hAnsiTheme="minorHAnsi" w:cstheme="minorHAnsi"/>
           <w:color w:val="222222"/>
           <w:sz w:val="21"/>
           <w:szCs w:val="21"/>
@@ -447,7 +493,7 @@
       <w:proofErr w:type="spellStart"/>
       <w:r>
         <w:rPr>
-          <w:rFonts w:ascii="Calibri" w:eastAsia="Calibri" w:hAnsi="Calibri" w:cs="Calibri"/>
+          <w:rFonts w:asciiTheme="minorHAnsi" w:eastAsia="Calibri" w:hAnsiTheme="minorHAnsi" w:cstheme="minorHAnsi"/>
           <w:color w:val="222222"/>
           <w:sz w:val="21"/>
           <w:szCs w:val="21"/>
@@ -457,7 +503,7 @@
       <w:proofErr w:type="spellEnd"/>
       <w:r>
         <w:rPr>
-          <w:rFonts w:ascii="Calibri" w:eastAsia="Calibri" w:hAnsi="Calibri" w:cs="Calibri"/>
+          <w:rFonts w:asciiTheme="minorHAnsi" w:eastAsia="Calibri" w:hAnsiTheme="minorHAnsi" w:cstheme="minorHAnsi"/>
           <w:color w:val="222222"/>
           <w:sz w:val="21"/>
           <w:szCs w:val="21"/>
@@ -467,7 +513,7 @@
       <w:proofErr w:type="spellStart"/>
       <w:r>
         <w:rPr>
-          <w:rFonts w:ascii="Calibri" w:eastAsia="Calibri" w:hAnsi="Calibri" w:cs="Calibri"/>
+          <w:rFonts w:asciiTheme="minorHAnsi" w:eastAsia="Calibri" w:hAnsiTheme="minorHAnsi" w:cstheme="minorHAnsi"/>
           <w:color w:val="222222"/>
           <w:sz w:val="21"/>
           <w:szCs w:val="21"/>
@@ -476,12 +522,12 @@
       </w:r>
       <w:r>
         <w:rPr>
-          <w:rFonts w:ascii="Calibri" w:eastAsia="Calibri" w:hAnsi="Calibri" w:cs="Calibri"/>
-          <w:color w:val="222222"/>
-          <w:sz w:val="21"/>
-          <w:szCs w:val="21"/>
-        </w:rPr>
-        <w:t>,GitLab,GitAction</w:t>
+          <w:rFonts w:asciiTheme="minorHAnsi" w:eastAsia="Calibri" w:hAnsiTheme="minorHAnsi" w:cstheme="minorHAnsi"/>
+          <w:color w:val="222222"/>
+          <w:sz w:val="21"/>
+          <w:szCs w:val="21"/>
+        </w:rPr>
+        <w:t>,GitLab</w:t>
       </w:r>
       <w:proofErr w:type="spellEnd"/>
     </w:p>
@@ -493,10 +539,13 @@
           <w:numId w:val="2"/>
         </w:numPr>
         <w:spacing w:after="60"/>
-      </w:pPr>
-      <w:r>
-        <w:rPr>
-          <w:rFonts w:ascii="Calibri" w:eastAsia="Calibri" w:hAnsi="Calibri" w:cs="Calibri"/>
+        <w:rPr>
+          <w:rFonts w:asciiTheme="minorHAnsi" w:hAnsiTheme="minorHAnsi" w:cstheme="minorHAnsi"/>
+        </w:rPr>
+      </w:pPr>
+      <w:r>
+        <w:rPr>
+          <w:rFonts w:asciiTheme="minorHAnsi" w:eastAsia="Calibri" w:hAnsiTheme="minorHAnsi" w:cstheme="minorHAnsi"/>
           <w:color w:val="222222"/>
           <w:sz w:val="21"/>
           <w:szCs w:val="21"/>
@@ -512,10 +561,13 @@
           <w:numId w:val="2"/>
         </w:numPr>
         <w:spacing w:after="60"/>
-      </w:pPr>
-      <w:r>
-        <w:rPr>
-          <w:rFonts w:ascii="Calibri" w:eastAsia="Calibri" w:hAnsi="Calibri" w:cs="Calibri"/>
+        <w:rPr>
+          <w:rFonts w:asciiTheme="minorHAnsi" w:hAnsiTheme="minorHAnsi" w:cstheme="minorHAnsi"/>
+        </w:rPr>
+      </w:pPr>
+      <w:r>
+        <w:rPr>
+          <w:rFonts w:asciiTheme="minorHAnsi" w:eastAsia="Calibri" w:hAnsiTheme="minorHAnsi" w:cstheme="minorHAnsi"/>
           <w:color w:val="222222"/>
           <w:sz w:val="21"/>
           <w:szCs w:val="21"/>
@@ -529,10 +581,13 @@
           <w:bottom w:val="single" w:sz="6" w:space="2" w:color="1F3864"/>
         </w:pBdr>
         <w:spacing w:before="260" w:after="100"/>
-      </w:pPr>
-      <w:r>
-        <w:rPr>
-          <w:rFonts w:ascii="Calibri" w:eastAsia="Calibri" w:hAnsi="Calibri" w:cs="Calibri"/>
+        <w:rPr>
+          <w:rFonts w:asciiTheme="minorHAnsi" w:hAnsiTheme="minorHAnsi" w:cstheme="minorHAnsi"/>
+        </w:rPr>
+      </w:pPr>
+      <w:r>
+        <w:rPr>
+          <w:rFonts w:asciiTheme="minorHAnsi" w:eastAsia="Calibri" w:hAnsiTheme="minorHAnsi" w:cstheme="minorHAnsi"/>
           <w:b/>
           <w:bCs/>
           <w:color w:val="1F3864"/>
@@ -540,6 +595,184 @@
           <w:szCs w:val="22"/>
         </w:rPr>
         <w:t>EDUCATION</w:t>
+      </w:r>
+    </w:p>
+    <w:p>
+      <w:pPr>
+        <w:pBdr>
+          <w:bottom w:val="single" w:sz="6" w:space="2" w:color="1F3864"/>
+        </w:pBdr>
+        <w:spacing w:before="260" w:after="100"/>
+        <w:rPr>
+          <w:rFonts w:asciiTheme="minorHAnsi" w:eastAsia="Calibri" w:hAnsiTheme="minorHAnsi" w:cstheme="minorHAnsi"/>
+          <w:bCs/>
+          <w:color w:val="222222"/>
+          <w:sz w:val="22"/>
+          <w:szCs w:val="22"/>
+        </w:rPr>
+      </w:pPr>
+      <w:r>
+        <w:rPr>
+          <w:rFonts w:asciiTheme="minorHAnsi" w:eastAsia="Calibri" w:hAnsiTheme="minorHAnsi" w:cstheme="minorHAnsi"/>
+          <w:b/>
+          <w:bCs/>
+          <w:color w:val="222222"/>
+          <w:sz w:val="22"/>
+          <w:szCs w:val="22"/>
+        </w:rPr>
+        <w:t xml:space="preserve">Master of Computer Science (MCS) | </w:t>
+      </w:r>
+      <w:r>
+        <w:rPr>
+          <w:rFonts w:asciiTheme="minorHAnsi" w:eastAsia="Calibri" w:hAnsiTheme="minorHAnsi" w:cstheme="minorHAnsi"/>
+          <w:bCs/>
+          <w:color w:val="222222"/>
+          <w:sz w:val="22"/>
+          <w:szCs w:val="22"/>
+        </w:rPr>
+        <w:t xml:space="preserve">Modern College of Arts, Science and Commerce, </w:t>
+      </w:r>
+      <w:proofErr w:type="spellStart"/>
+      <w:r>
+        <w:rPr>
+          <w:rFonts w:asciiTheme="minorHAnsi" w:eastAsia="Calibri" w:hAnsiTheme="minorHAnsi" w:cstheme="minorHAnsi"/>
+          <w:bCs/>
+          <w:color w:val="222222"/>
+          <w:sz w:val="22"/>
+          <w:szCs w:val="22"/>
+        </w:rPr>
+        <w:t>Pune</w:t>
+      </w:r>
+      <w:proofErr w:type="spellEnd"/>
+      <w:r>
+        <w:rPr>
+          <w:rFonts w:asciiTheme="minorHAnsi" w:eastAsia="Calibri" w:hAnsiTheme="minorHAnsi" w:cstheme="minorHAnsi"/>
+          <w:bCs/>
+          <w:color w:val="222222"/>
+          <w:sz w:val="22"/>
+          <w:szCs w:val="22"/>
+        </w:rPr>
+        <w:t xml:space="preserve"> | J</w:t>
+      </w:r>
+      <w:r>
+        <w:rPr>
+          <w:rFonts w:asciiTheme="minorHAnsi" w:eastAsia="Calibri" w:hAnsiTheme="minorHAnsi" w:cstheme="minorHAnsi"/>
+          <w:bCs/>
+          <w:color w:val="222222"/>
+          <w:sz w:val="22"/>
+          <w:szCs w:val="22"/>
+        </w:rPr>
+        <w:t>une 2024 – June 2026 | CGPA: 6.</w:t>
+      </w:r>
+      <w:r>
+        <w:rPr>
+          <w:rFonts w:asciiTheme="minorHAnsi" w:eastAsia="Calibri" w:hAnsiTheme="minorHAnsi" w:cstheme="minorHAnsi"/>
+          <w:bCs/>
+          <w:color w:val="222222"/>
+          <w:sz w:val="22"/>
+          <w:szCs w:val="22"/>
+        </w:rPr>
+        <w:t>2</w:t>
+      </w:r>
+    </w:p>
+    <w:p>
+      <w:pPr>
+        <w:pBdr>
+          <w:bottom w:val="single" w:sz="6" w:space="2" w:color="1F3864"/>
+        </w:pBdr>
+        <w:spacing w:before="260" w:after="100"/>
+        <w:rPr>
+          <w:rFonts w:asciiTheme="minorHAnsi" w:eastAsia="Calibri" w:hAnsiTheme="minorHAnsi" w:cstheme="minorHAnsi"/>
+          <w:bCs/>
+          <w:color w:val="222222"/>
+          <w:sz w:val="22"/>
+          <w:szCs w:val="22"/>
+        </w:rPr>
+      </w:pPr>
+      <w:r>
+        <w:rPr>
+          <w:rFonts w:asciiTheme="minorHAnsi" w:eastAsia="Calibri" w:hAnsiTheme="minorHAnsi" w:cstheme="minorHAnsi"/>
+          <w:b/>
+          <w:bCs/>
+          <w:color w:val="222222"/>
+          <w:sz w:val="22"/>
+          <w:szCs w:val="22"/>
+        </w:rPr>
+        <w:t xml:space="preserve"> Bachelor of Computer Science (BCS) </w:t>
+      </w:r>
+      <w:r>
+        <w:rPr>
+          <w:rFonts w:asciiTheme="minorHAnsi" w:eastAsia="Calibri" w:hAnsiTheme="minorHAnsi" w:cstheme="minorHAnsi"/>
+          <w:bCs/>
+          <w:color w:val="222222"/>
+          <w:sz w:val="22"/>
+          <w:szCs w:val="22"/>
+        </w:rPr>
+        <w:t xml:space="preserve">| Modern College of Arts, Science and Commerce, </w:t>
+      </w:r>
+      <w:proofErr w:type="spellStart"/>
+      <w:r>
+        <w:rPr>
+          <w:rFonts w:asciiTheme="minorHAnsi" w:eastAsia="Calibri" w:hAnsiTheme="minorHAnsi" w:cstheme="minorHAnsi"/>
+          <w:bCs/>
+          <w:color w:val="222222"/>
+          <w:sz w:val="22"/>
+          <w:szCs w:val="22"/>
+        </w:rPr>
+        <w:t>Pune</w:t>
+      </w:r>
+      <w:proofErr w:type="spellEnd"/>
+      <w:r>
+        <w:rPr>
+          <w:rFonts w:asciiTheme="minorHAnsi" w:eastAsia="Calibri" w:hAnsiTheme="minorHAnsi" w:cstheme="minorHAnsi"/>
+          <w:bCs/>
+          <w:color w:val="222222"/>
+          <w:sz w:val="22"/>
+          <w:szCs w:val="22"/>
+        </w:rPr>
+        <w:t xml:space="preserve"> | Jun</w:t>
+      </w:r>
+      <w:r>
+        <w:rPr>
+          <w:rFonts w:asciiTheme="minorHAnsi" w:eastAsia="Calibri" w:hAnsiTheme="minorHAnsi" w:cstheme="minorHAnsi"/>
+          <w:bCs/>
+          <w:color w:val="222222"/>
+          <w:sz w:val="22"/>
+          <w:szCs w:val="22"/>
+        </w:rPr>
+        <w:t>e 2021 – June 2024 | CGPA: 6</w:t>
+      </w:r>
+      <w:r>
+        <w:rPr>
+          <w:rFonts w:asciiTheme="minorHAnsi" w:eastAsia="Calibri" w:hAnsiTheme="minorHAnsi" w:cstheme="minorHAnsi"/>
+          <w:bCs/>
+          <w:color w:val="222222"/>
+          <w:sz w:val="22"/>
+          <w:szCs w:val="22"/>
+        </w:rPr>
+        <w:t>.25</w:t>
+      </w:r>
+    </w:p>
+    <w:p>
+      <w:pPr>
+        <w:pBdr>
+          <w:bottom w:val="single" w:sz="6" w:space="2" w:color="1F3864"/>
+        </w:pBdr>
+        <w:spacing w:before="260" w:after="100"/>
+        <w:rPr>
+          <w:rFonts w:asciiTheme="minorHAnsi" w:hAnsiTheme="minorHAnsi" w:cstheme="minorHAnsi"/>
+        </w:rPr>
+      </w:pPr>
+      <w:r>
+        <w:rPr>
+          <w:rFonts w:asciiTheme="minorHAnsi" w:eastAsia="Calibri" w:hAnsiTheme="minorHAnsi" w:cstheme="minorHAnsi"/>
+          <w:b/>
+          <w:bCs/>
+          <w:color w:val="1F3864"/>
+          <w:sz w:val="22"/>
+          <w:szCs w:val="22"/>
+        </w:rPr>
+        <w:t>PROJECTS</w:t>
       </w:r>
     </w:p>
     <w:p>
@@ -548,102 +781,13 @@
           <w:tab w:val="right" w:pos="9360"/>
         </w:tabs>
         <w:spacing w:after="20"/>
-      </w:pPr>
-      <w:proofErr w:type="spellStart"/>
-      <w:r>
-        <w:rPr>
-          <w:rFonts w:ascii="Calibri" w:eastAsia="Calibri" w:hAnsi="Calibri" w:cs="Calibri"/>
-          <w:b/>
-          <w:bCs/>
-          <w:color w:val="222222"/>
-          <w:sz w:val="22"/>
-          <w:szCs w:val="22"/>
-        </w:rPr>
-        <w:t>M.Sc</w:t>
-      </w:r>
-      <w:proofErr w:type="spellEnd"/>
-      <w:r>
-        <w:rPr>
-          <w:rFonts w:ascii="Calibri" w:eastAsia="Calibri" w:hAnsi="Calibri" w:cs="Calibri"/>
-          <w:b/>
-          <w:bCs/>
-          <w:color w:val="222222"/>
-          <w:sz w:val="22"/>
-          <w:szCs w:val="22"/>
-        </w:rPr>
-        <w:t xml:space="preserve"> (Computer Science)</w:t>
-      </w:r>
-      <w:r>
-        <w:rPr>
-          <w:rFonts w:ascii="Calibri" w:eastAsia="Calibri" w:hAnsi="Calibri" w:cs="Calibri"/>
-          <w:i/>
-          <w:iCs/>
-          <w:color w:val="555555"/>
-        </w:rPr>
-        <w:tab/>
-        <w:t>2026</w:t>
-      </w:r>
-    </w:p>
-    <w:p>
-      <w:pPr>
-        <w:spacing w:after="60"/>
-      </w:pPr>
-      <w:r>
-        <w:rPr>
-          <w:rFonts w:ascii="Calibri" w:eastAsia="Calibri" w:hAnsi="Calibri" w:cs="Calibri"/>
-          <w:iCs/>
-          <w:color w:val="555555"/>
-        </w:rPr>
-        <w:t xml:space="preserve">Modern College of Arts, Commerce and Science, </w:t>
-      </w:r>
-      <w:proofErr w:type="spellStart"/>
-      <w:r>
-        <w:rPr>
-          <w:rFonts w:ascii="Calibri" w:eastAsia="Calibri" w:hAnsi="Calibri" w:cs="Calibri"/>
-          <w:iCs/>
-          <w:color w:val="555555"/>
-        </w:rPr>
-        <w:t>Pune</w:t>
-      </w:r>
-      <w:proofErr w:type="spellEnd"/>
-      <w:r>
-        <w:rPr>
-          <w:rFonts w:ascii="Calibri" w:eastAsia="Calibri" w:hAnsi="Calibri" w:cs="Calibri"/>
-          <w:iCs/>
-          <w:color w:val="555555"/>
-        </w:rPr>
-        <w:t xml:space="preserve"> — Percentage: 62%</w:t>
-      </w:r>
-    </w:p>
-    <w:p>
-      <w:pPr>
-        <w:pBdr>
-          <w:bottom w:val="single" w:sz="6" w:space="2" w:color="1F3864"/>
-        </w:pBdr>
-        <w:spacing w:before="260" w:after="100"/>
-      </w:pPr>
-      <w:r>
-        <w:rPr>
-          <w:rFonts w:ascii="Calibri" w:eastAsia="Calibri" w:hAnsi="Calibri" w:cs="Calibri"/>
-          <w:b/>
-          <w:bCs/>
-          <w:color w:val="1F3864"/>
-          <w:sz w:val="22"/>
-          <w:szCs w:val="22"/>
-        </w:rPr>
-        <w:t>PROJECTS</w:t>
-      </w:r>
-    </w:p>
-    <w:p>
-      <w:pPr>
-        <w:tabs>
-          <w:tab w:val="right" w:pos="9360"/>
-        </w:tabs>
-        <w:spacing w:after="20"/>
-      </w:pPr>
-      <w:r>
-        <w:rPr>
-          <w:rFonts w:ascii="Calibri" w:eastAsia="Calibri" w:hAnsi="Calibri" w:cs="Calibri"/>
+        <w:rPr>
+          <w:rFonts w:asciiTheme="minorHAnsi" w:hAnsiTheme="minorHAnsi" w:cstheme="minorHAnsi"/>
+        </w:rPr>
+      </w:pPr>
+      <w:r>
+        <w:rPr>
+          <w:rFonts w:asciiTheme="minorHAnsi" w:eastAsia="Calibri" w:hAnsiTheme="minorHAnsi" w:cstheme="minorHAnsi"/>
           <w:b/>
           <w:bCs/>
           <w:color w:val="222222"/>
@@ -661,10 +805,13 @@
           <w:numId w:val="2"/>
         </w:numPr>
         <w:spacing w:after="60"/>
-      </w:pPr>
-      <w:r>
-        <w:rPr>
-          <w:rFonts w:ascii="Calibri" w:eastAsia="Calibri" w:hAnsi="Calibri" w:cs="Calibri"/>
+        <w:rPr>
+          <w:rFonts w:asciiTheme="minorHAnsi" w:hAnsiTheme="minorHAnsi" w:cstheme="minorHAnsi"/>
+        </w:rPr>
+      </w:pPr>
+      <w:r>
+        <w:rPr>
+          <w:rFonts w:asciiTheme="minorHAnsi" w:eastAsia="Calibri" w:hAnsiTheme="minorHAnsi" w:cstheme="minorHAnsi"/>
           <w:color w:val="222222"/>
           <w:sz w:val="21"/>
           <w:szCs w:val="21"/>
@@ -674,7 +821,7 @@
       <w:proofErr w:type="gramStart"/>
       <w:r>
         <w:rPr>
-          <w:rFonts w:ascii="Calibri" w:eastAsia="Calibri" w:hAnsi="Calibri" w:cs="Calibri"/>
+          <w:rFonts w:asciiTheme="minorHAnsi" w:eastAsia="Calibri" w:hAnsiTheme="minorHAnsi" w:cstheme="minorHAnsi"/>
           <w:color w:val="222222"/>
           <w:sz w:val="21"/>
           <w:szCs w:val="21"/>
@@ -684,7 +831,7 @@
       <w:proofErr w:type="gramEnd"/>
       <w:r>
         <w:rPr>
-          <w:rFonts w:ascii="Calibri" w:eastAsia="Calibri" w:hAnsi="Calibri" w:cs="Calibri"/>
+          <w:rFonts w:asciiTheme="minorHAnsi" w:eastAsia="Calibri" w:hAnsiTheme="minorHAnsi" w:cstheme="minorHAnsi"/>
           <w:color w:val="222222"/>
           <w:sz w:val="21"/>
           <w:szCs w:val="21"/>
@@ -700,10 +847,13 @@
           <w:numId w:val="2"/>
         </w:numPr>
         <w:spacing w:after="60"/>
-      </w:pPr>
-      <w:r>
-        <w:rPr>
-          <w:rFonts w:ascii="Calibri" w:eastAsia="Calibri" w:hAnsi="Calibri" w:cs="Calibri"/>
+        <w:rPr>
+          <w:rFonts w:asciiTheme="minorHAnsi" w:hAnsiTheme="minorHAnsi" w:cstheme="minorHAnsi"/>
+        </w:rPr>
+      </w:pPr>
+      <w:r>
+        <w:rPr>
+          <w:rFonts w:asciiTheme="minorHAnsi" w:eastAsia="Calibri" w:hAnsiTheme="minorHAnsi" w:cstheme="minorHAnsi"/>
           <w:color w:val="222222"/>
           <w:sz w:val="21"/>
           <w:szCs w:val="21"/>
@@ -719,10 +869,13 @@
           <w:numId w:val="2"/>
         </w:numPr>
         <w:spacing w:after="60"/>
-      </w:pPr>
-      <w:r>
-        <w:rPr>
-          <w:rFonts w:ascii="Calibri" w:eastAsia="Calibri" w:hAnsi="Calibri" w:cs="Calibri"/>
+        <w:rPr>
+          <w:rFonts w:asciiTheme="minorHAnsi" w:hAnsiTheme="minorHAnsi" w:cstheme="minorHAnsi"/>
+        </w:rPr>
+      </w:pPr>
+      <w:r>
+        <w:rPr>
+          <w:rFonts w:asciiTheme="minorHAnsi" w:eastAsia="Calibri" w:hAnsiTheme="minorHAnsi" w:cstheme="minorHAnsi"/>
           <w:color w:val="222222"/>
           <w:sz w:val="21"/>
           <w:szCs w:val="21"/>
@@ -734,12 +887,14 @@
       <w:pPr>
         <w:spacing w:before="100" w:beforeAutospacing="1" w:after="100" w:afterAutospacing="1"/>
         <w:rPr>
+          <w:rFonts w:asciiTheme="minorHAnsi" w:hAnsiTheme="minorHAnsi" w:cstheme="minorHAnsi"/>
           <w:sz w:val="22"/>
           <w:szCs w:val="24"/>
         </w:rPr>
       </w:pPr>
       <w:r>
         <w:rPr>
+          <w:rFonts w:asciiTheme="minorHAnsi" w:hAnsiTheme="minorHAnsi" w:cstheme="minorHAnsi"/>
           <w:b/>
           <w:bCs/>
           <w:sz w:val="22"/>
@@ -750,6 +905,7 @@
       <w:proofErr w:type="spellStart"/>
       <w:r>
         <w:rPr>
+          <w:rFonts w:asciiTheme="minorHAnsi" w:hAnsiTheme="minorHAnsi" w:cstheme="minorHAnsi"/>
           <w:b/>
           <w:bCs/>
           <w:sz w:val="22"/>
@@ -760,6 +916,7 @@
       <w:proofErr w:type="spellEnd"/>
       <w:r>
         <w:rPr>
+          <w:rFonts w:asciiTheme="minorHAnsi" w:hAnsiTheme="minorHAnsi" w:cstheme="minorHAnsi"/>
           <w:b/>
           <w:bCs/>
           <w:sz w:val="22"/>
@@ -776,12 +933,14 @@
         </w:numPr>
         <w:spacing w:before="100" w:beforeAutospacing="1" w:after="100" w:afterAutospacing="1"/>
         <w:rPr>
-          <w:sz w:val="21"/>
-          <w:szCs w:val="21"/>
-        </w:rPr>
-      </w:pPr>
-      <w:r>
-        <w:rPr>
+          <w:rFonts w:asciiTheme="minorHAnsi" w:hAnsiTheme="minorHAnsi" w:cstheme="minorHAnsi"/>
+          <w:sz w:val="21"/>
+          <w:szCs w:val="21"/>
+        </w:rPr>
+      </w:pPr>
+      <w:r>
+        <w:rPr>
+          <w:rFonts w:asciiTheme="minorHAnsi" w:hAnsiTheme="minorHAnsi" w:cstheme="minorHAnsi"/>
           <w:sz w:val="21"/>
           <w:szCs w:val="21"/>
         </w:rPr>
@@ -789,6 +948,7 @@
       </w:r>
       <w:r>
         <w:rPr>
+          <w:rFonts w:asciiTheme="minorHAnsi" w:hAnsiTheme="minorHAnsi" w:cstheme="minorHAnsi"/>
           <w:b/>
           <w:bCs/>
           <w:sz w:val="21"/>
@@ -798,6 +958,7 @@
       </w:r>
       <w:r>
         <w:rPr>
+          <w:rFonts w:asciiTheme="minorHAnsi" w:hAnsiTheme="minorHAnsi" w:cstheme="minorHAnsi"/>
           <w:sz w:val="21"/>
           <w:szCs w:val="21"/>
         </w:rPr>
@@ -812,12 +973,14 @@
         </w:numPr>
         <w:spacing w:before="100" w:beforeAutospacing="1" w:after="100" w:afterAutospacing="1"/>
         <w:rPr>
-          <w:sz w:val="21"/>
-          <w:szCs w:val="21"/>
-        </w:rPr>
-      </w:pPr>
-      <w:r>
-        <w:rPr>
+          <w:rFonts w:asciiTheme="minorHAnsi" w:hAnsiTheme="minorHAnsi" w:cstheme="minorHAnsi"/>
+          <w:sz w:val="21"/>
+          <w:szCs w:val="21"/>
+        </w:rPr>
+      </w:pPr>
+      <w:r>
+        <w:rPr>
+          <w:rFonts w:asciiTheme="minorHAnsi" w:hAnsiTheme="minorHAnsi" w:cstheme="minorHAnsi"/>
           <w:sz w:val="21"/>
           <w:szCs w:val="21"/>
         </w:rPr>
@@ -825,6 +988,7 @@
       </w:r>
       <w:r>
         <w:rPr>
+          <w:rFonts w:asciiTheme="minorHAnsi" w:hAnsiTheme="minorHAnsi" w:cstheme="minorHAnsi"/>
           <w:b/>
           <w:bCs/>
           <w:sz w:val="21"/>
@@ -835,6 +999,7 @@
       <w:proofErr w:type="spellStart"/>
       <w:r>
         <w:rPr>
+          <w:rFonts w:asciiTheme="minorHAnsi" w:hAnsiTheme="minorHAnsi" w:cstheme="minorHAnsi"/>
           <w:b/>
           <w:bCs/>
           <w:sz w:val="21"/>
@@ -845,6 +1010,7 @@
       <w:proofErr w:type="spellEnd"/>
       <w:r>
         <w:rPr>
+          <w:rFonts w:asciiTheme="minorHAnsi" w:hAnsiTheme="minorHAnsi" w:cstheme="minorHAnsi"/>
           <w:b/>
           <w:bCs/>
           <w:sz w:val="21"/>
@@ -854,6 +1020,7 @@
       </w:r>
       <w:r>
         <w:rPr>
+          <w:rFonts w:asciiTheme="minorHAnsi" w:hAnsiTheme="minorHAnsi" w:cstheme="minorHAnsi"/>
           <w:sz w:val="21"/>
           <w:szCs w:val="21"/>
         </w:rPr>
@@ -868,12 +1035,14 @@
         </w:numPr>
         <w:spacing w:before="100" w:beforeAutospacing="1" w:after="100" w:afterAutospacing="1"/>
         <w:rPr>
-          <w:sz w:val="21"/>
-          <w:szCs w:val="21"/>
-        </w:rPr>
-      </w:pPr>
-      <w:r>
-        <w:rPr>
+          <w:rFonts w:asciiTheme="minorHAnsi" w:hAnsiTheme="minorHAnsi" w:cstheme="minorHAnsi"/>
+          <w:sz w:val="21"/>
+          <w:szCs w:val="21"/>
+        </w:rPr>
+      </w:pPr>
+      <w:r>
+        <w:rPr>
+          <w:rFonts w:asciiTheme="minorHAnsi" w:hAnsiTheme="minorHAnsi" w:cstheme="minorHAnsi"/>
           <w:sz w:val="21"/>
           <w:szCs w:val="21"/>
         </w:rPr>
@@ -881,6 +1050,7 @@
       </w:r>
       <w:r>
         <w:rPr>
+          <w:rFonts w:asciiTheme="minorHAnsi" w:hAnsiTheme="minorHAnsi" w:cstheme="minorHAnsi"/>
           <w:b/>
           <w:bCs/>
           <w:sz w:val="21"/>
@@ -890,6 +1060,7 @@
       </w:r>
       <w:r>
         <w:rPr>
+          <w:rFonts w:asciiTheme="minorHAnsi" w:hAnsiTheme="minorHAnsi" w:cstheme="minorHAnsi"/>
           <w:sz w:val="21"/>
           <w:szCs w:val="21"/>
         </w:rPr>
@@ -902,95 +1073,151 @@
           <w:bottom w:val="single" w:sz="6" w:space="2" w:color="1F3864"/>
         </w:pBdr>
         <w:spacing w:before="260" w:after="100"/>
-      </w:pPr>
-      <w:r>
-        <w:rPr>
-          <w:rFonts w:ascii="Calibri" w:eastAsia="Calibri" w:hAnsi="Calibri" w:cs="Calibri"/>
+        <w:rPr>
+          <w:rFonts w:asciiTheme="minorHAnsi" w:hAnsiTheme="minorHAnsi" w:cstheme="minorHAnsi"/>
+        </w:rPr>
+      </w:pPr>
+      <w:proofErr w:type="gramStart"/>
+      <w:r>
+        <w:rPr>
+          <w:rFonts w:asciiTheme="minorHAnsi" w:eastAsia="Calibri" w:hAnsiTheme="minorHAnsi" w:cstheme="minorHAnsi"/>
           <w:b/>
           <w:bCs/>
           <w:color w:val="1F3864"/>
           <w:sz w:val="22"/>
           <w:szCs w:val="22"/>
         </w:rPr>
-        <w:t>INTERNSHIP EXPERIENCE</w:t>
-      </w:r>
-    </w:p>
-    <w:p>
-      <w:pPr>
-        <w:tabs>
-          <w:tab w:val="right" w:pos="9360"/>
-        </w:tabs>
-        <w:spacing w:after="20"/>
-      </w:pPr>
-      <w:r>
-        <w:rPr>
-          <w:rFonts w:ascii="Calibri" w:eastAsia="Calibri" w:hAnsi="Calibri" w:cs="Calibri"/>
-          <w:b/>
-          <w:bCs/>
-          <w:color w:val="222222"/>
-          <w:sz w:val="22"/>
-          <w:szCs w:val="22"/>
-        </w:rPr>
-        <w:t>Cloud/</w:t>
-      </w:r>
-      <w:proofErr w:type="spellStart"/>
-      <w:r>
-        <w:rPr>
-          <w:rFonts w:ascii="Calibri" w:eastAsia="Calibri" w:hAnsi="Calibri" w:cs="Calibri"/>
-          <w:b/>
-          <w:bCs/>
-          <w:color w:val="222222"/>
-          <w:sz w:val="22"/>
-          <w:szCs w:val="22"/>
-        </w:rPr>
-        <w:t>DevOps</w:t>
-      </w:r>
-      <w:proofErr w:type="spellEnd"/>
-      <w:r>
-        <w:rPr>
-          <w:rFonts w:ascii="Calibri" w:eastAsia="Calibri" w:hAnsi="Calibri" w:cs="Calibri"/>
-          <w:b/>
-          <w:bCs/>
-          <w:color w:val="222222"/>
-          <w:sz w:val="22"/>
-          <w:szCs w:val="22"/>
-        </w:rPr>
-        <w:t xml:space="preserve"> Intern</w:t>
-      </w:r>
-      <w:r>
-        <w:rPr>
-          <w:rFonts w:ascii="Calibri" w:eastAsia="Calibri" w:hAnsi="Calibri" w:cs="Calibri"/>
+        <w:t>CERTIFICATION</w:t>
+      </w:r>
+      <w:r>
+        <w:rPr>
+          <w:rFonts w:asciiTheme="minorHAnsi" w:eastAsia="Calibri" w:hAnsiTheme="minorHAnsi" w:cstheme="minorHAnsi"/>
           <w:i/>
           <w:iCs/>
           <w:color w:val="555555"/>
         </w:rPr>
-        <w:tab/>
-        <w:t>6 Months</w:t>
-      </w:r>
+        <w:t>.</w:t>
+      </w:r>
+      <w:proofErr w:type="gramEnd"/>
     </w:p>
     <w:p>
       <w:pPr>
         <w:spacing w:after="60"/>
-      </w:pPr>
-      <w:proofErr w:type="spellStart"/>
-      <w:r>
-        <w:rPr>
-          <w:rFonts w:ascii="Calibri" w:eastAsia="Calibri" w:hAnsi="Calibri" w:cs="Calibri"/>
-          <w:i/>
-          <w:iCs/>
-          <w:color w:val="555555"/>
-        </w:rPr>
-        <w:t>Cravita</w:t>
-      </w:r>
-      <w:proofErr w:type="spellEnd"/>
-      <w:r>
-        <w:rPr>
-          <w:rFonts w:ascii="Calibri" w:eastAsia="Calibri" w:hAnsi="Calibri" w:cs="Calibri"/>
-          <w:i/>
-          <w:iCs/>
-          <w:color w:val="555555"/>
-        </w:rPr>
-        <w:t xml:space="preserve"> Technologies Pvt. Ltd.</w:t>
+        <w:rPr>
+          <w:rFonts w:asciiTheme="minorHAnsi" w:hAnsiTheme="minorHAnsi" w:cstheme="minorHAnsi"/>
+        </w:rPr>
+      </w:pPr>
+      <w:r>
+        <w:rPr>
+          <w:rFonts w:asciiTheme="minorHAnsi" w:eastAsia="Calibri" w:hAnsiTheme="minorHAnsi" w:cstheme="minorHAnsi"/>
+          <w:color w:val="222222"/>
+          <w:sz w:val="21"/>
+          <w:szCs w:val="21"/>
+        </w:rPr>
+        <w:t xml:space="preserve">    </w:t>
+      </w:r>
+      <w:r>
+        <w:rPr>
+          <w:rFonts w:asciiTheme="minorHAnsi" w:eastAsia="Calibri" w:hAnsiTheme="minorHAnsi" w:cstheme="minorHAnsi"/>
+          <w:color w:val="222222"/>
+          <w:sz w:val="21"/>
+          <w:szCs w:val="21"/>
+        </w:rPr>
+        <w:t xml:space="preserve">• AWS Academy Graduate – Cloud Foundation Training Badge </w:t>
+      </w:r>
+    </w:p>
+    <w:p>
+      <w:pPr>
+        <w:spacing w:after="60"/>
+        <w:ind w:left="180"/>
+        <w:rPr>
+          <w:rFonts w:asciiTheme="minorHAnsi" w:hAnsiTheme="minorHAnsi" w:cstheme="minorHAnsi"/>
+        </w:rPr>
+      </w:pPr>
+      <w:r>
+        <w:rPr>
+          <w:rFonts w:asciiTheme="minorHAnsi" w:eastAsia="Calibri" w:hAnsiTheme="minorHAnsi" w:cstheme="minorHAnsi"/>
+          <w:color w:val="222222"/>
+          <w:sz w:val="21"/>
+          <w:szCs w:val="21"/>
+        </w:rPr>
+        <w:t xml:space="preserve">• AWS Training &amp; Certification – Cloud Essentials for Researchers Learning Plan </w:t>
+      </w:r>
+    </w:p>
+    <w:p>
+      <w:pPr>
+        <w:spacing w:after="60"/>
+        <w:ind w:left="180"/>
+        <w:rPr>
+          <w:rFonts w:asciiTheme="minorHAnsi" w:hAnsiTheme="minorHAnsi" w:cstheme="minorHAnsi"/>
+        </w:rPr>
+      </w:pPr>
+      <w:r>
+        <w:rPr>
+          <w:rFonts w:asciiTheme="minorHAnsi" w:eastAsia="Calibri" w:hAnsiTheme="minorHAnsi" w:cstheme="minorHAnsi"/>
+          <w:color w:val="222222"/>
+          <w:sz w:val="21"/>
+          <w:szCs w:val="21"/>
+        </w:rPr>
+        <w:t>• Master in Cloud Architecture – Fortune Cloud Technologies Private Limited</w:t>
+      </w:r>
+      <w:r>
+        <w:rPr>
+          <w:rFonts w:asciiTheme="minorHAnsi" w:eastAsia="Calibri" w:hAnsiTheme="minorHAnsi" w:cstheme="minorHAnsi"/>
+          <w:color w:val="222222"/>
+          <w:sz w:val="21"/>
+          <w:szCs w:val="21"/>
+        </w:rPr>
+        <w:t>.</w:t>
+      </w:r>
+    </w:p>
+    <w:p>
+      <w:pPr>
+        <w:pBdr>
+          <w:bottom w:val="single" w:sz="6" w:space="2" w:color="1F3864"/>
+        </w:pBdr>
+        <w:spacing w:before="260" w:after="100"/>
+        <w:rPr>
+          <w:rFonts w:asciiTheme="minorHAnsi" w:hAnsiTheme="minorHAnsi" w:cstheme="minorHAnsi"/>
+        </w:rPr>
+      </w:pPr>
+    </w:p>
+    <w:p>
+      <w:pPr>
+        <w:pBdr>
+          <w:bottom w:val="single" w:sz="6" w:space="2" w:color="1F3864"/>
+        </w:pBdr>
+        <w:spacing w:before="260" w:after="100"/>
+        <w:rPr>
+          <w:rFonts w:asciiTheme="minorHAnsi" w:eastAsia="Calibri" w:hAnsiTheme="minorHAnsi" w:cstheme="minorHAnsi"/>
+          <w:b/>
+          <w:bCs/>
+          <w:color w:val="1F3864"/>
+          <w:sz w:val="22"/>
+          <w:szCs w:val="22"/>
+        </w:rPr>
+      </w:pPr>
+    </w:p>
+    <w:p>
+      <w:pPr>
+        <w:pBdr>
+          <w:bottom w:val="single" w:sz="6" w:space="2" w:color="1F3864"/>
+        </w:pBdr>
+        <w:spacing w:before="260" w:after="100"/>
+        <w:rPr>
+          <w:rFonts w:asciiTheme="minorHAnsi" w:hAnsiTheme="minorHAnsi" w:cstheme="minorHAnsi"/>
+        </w:rPr>
+      </w:pPr>
+      <w:r>
+        <w:rPr>
+          <w:rFonts w:asciiTheme="minorHAnsi" w:eastAsia="Calibri" w:hAnsiTheme="minorHAnsi" w:cstheme="minorHAnsi"/>
+          <w:b/>
+          <w:bCs/>
+          <w:color w:val="1F3864"/>
+          <w:sz w:val="22"/>
+          <w:szCs w:val="22"/>
+        </w:rPr>
+        <w:t>ADDITIONAL INFORMATION</w:t>
       </w:r>
     </w:p>
     <w:p>
@@ -1001,55 +1228,18 @@
           <w:numId w:val="2"/>
         </w:numPr>
         <w:spacing w:after="60"/>
-      </w:pPr>
-      <w:r>
-        <w:rPr>
-          <w:rFonts w:ascii="Calibri" w:eastAsia="Calibri" w:hAnsi="Calibri" w:cs="Calibri"/>
-          <w:color w:val="222222"/>
-          <w:sz w:val="21"/>
-          <w:szCs w:val="21"/>
-        </w:rPr>
-        <w:t xml:space="preserve">Gained hands-on exposure to AWS cloud infrastructure, </w:t>
-      </w:r>
-      <w:proofErr w:type="spellStart"/>
-      <w:r>
-        <w:rPr>
-          <w:rFonts w:ascii="Calibri" w:eastAsia="Calibri" w:hAnsi="Calibri" w:cs="Calibri"/>
-          <w:color w:val="222222"/>
-          <w:sz w:val="21"/>
-          <w:szCs w:val="21"/>
-        </w:rPr>
-        <w:t>Docker</w:t>
-      </w:r>
-      <w:proofErr w:type="spellEnd"/>
-      <w:r>
-        <w:rPr>
-          <w:rFonts w:ascii="Calibri" w:eastAsia="Calibri" w:hAnsi="Calibri" w:cs="Calibri"/>
-          <w:color w:val="222222"/>
-          <w:sz w:val="21"/>
-          <w:szCs w:val="21"/>
-        </w:rPr>
-        <w:t xml:space="preserve"> containerization, and </w:t>
-      </w:r>
-      <w:proofErr w:type="spellStart"/>
-      <w:r>
-        <w:rPr>
-          <w:rFonts w:ascii="Calibri" w:eastAsia="Calibri" w:hAnsi="Calibri" w:cs="Calibri"/>
-          <w:color w:val="222222"/>
-          <w:sz w:val="21"/>
-          <w:szCs w:val="21"/>
-        </w:rPr>
-        <w:t>Kubernetes</w:t>
-      </w:r>
-      <w:proofErr w:type="spellEnd"/>
-      <w:r>
-        <w:rPr>
-          <w:rFonts w:ascii="Calibri" w:eastAsia="Calibri" w:hAnsi="Calibri" w:cs="Calibri"/>
-          <w:color w:val="222222"/>
-          <w:sz w:val="21"/>
-          <w:szCs w:val="21"/>
-        </w:rPr>
-        <w:t xml:space="preserve"> orchestration.</w:t>
+        <w:rPr>
+          <w:rFonts w:asciiTheme="minorHAnsi" w:hAnsiTheme="minorHAnsi" w:cstheme="minorHAnsi"/>
+        </w:rPr>
+      </w:pPr>
+      <w:r>
+        <w:rPr>
+          <w:rFonts w:asciiTheme="minorHAnsi" w:eastAsia="Calibri" w:hAnsiTheme="minorHAnsi" w:cstheme="minorHAnsi"/>
+          <w:color w:val="222222"/>
+          <w:sz w:val="21"/>
+          <w:szCs w:val="21"/>
+        </w:rPr>
+        <w:t>Languages Known: English, Hindi, Marathi</w:t>
       </w:r>
     </w:p>
     <w:p>
@@ -1060,15 +1250,18 @@
           <w:numId w:val="2"/>
         </w:numPr>
         <w:spacing w:after="60"/>
-      </w:pPr>
-      <w:r>
-        <w:rPr>
-          <w:rFonts w:ascii="Calibri" w:eastAsia="Calibri" w:hAnsi="Calibri" w:cs="Calibri"/>
-          <w:color w:val="222222"/>
-          <w:sz w:val="21"/>
-          <w:szCs w:val="21"/>
-        </w:rPr>
-        <w:t>Assisted in building and maintaining CI/CD pipelines using Jenkins for automated build and deployment.</w:t>
+        <w:rPr>
+          <w:rFonts w:asciiTheme="minorHAnsi" w:hAnsiTheme="minorHAnsi" w:cstheme="minorHAnsi"/>
+        </w:rPr>
+      </w:pPr>
+      <w:r>
+        <w:rPr>
+          <w:rFonts w:asciiTheme="minorHAnsi" w:eastAsia="Calibri" w:hAnsiTheme="minorHAnsi" w:cstheme="minorHAnsi"/>
+          <w:color w:val="222222"/>
+          <w:sz w:val="21"/>
+          <w:szCs w:val="21"/>
+        </w:rPr>
+        <w:t>Soft Skills: Problem-solving, Team Collaboration, Quick Learner, Communication</w:t>
       </w:r>
     </w:p>
     <w:p>
@@ -1079,244 +1272,27 @@
           <w:numId w:val="2"/>
         </w:numPr>
         <w:spacing w:after="60"/>
-      </w:pPr>
-      <w:r>
-        <w:rPr>
-          <w:rFonts w:ascii="Calibri" w:eastAsia="Calibri" w:hAnsi="Calibri" w:cs="Calibri"/>
-          <w:color w:val="222222"/>
-          <w:sz w:val="21"/>
-          <w:szCs w:val="21"/>
-        </w:rPr>
-        <w:t xml:space="preserve">Worked with </w:t>
-      </w:r>
-      <w:proofErr w:type="spellStart"/>
-      <w:r>
-        <w:rPr>
-          <w:rFonts w:ascii="Calibri" w:eastAsia="Calibri" w:hAnsi="Calibri" w:cs="Calibri"/>
-          <w:color w:val="222222"/>
-          <w:sz w:val="21"/>
-          <w:szCs w:val="21"/>
-        </w:rPr>
-        <w:t>Ansible</w:t>
-      </w:r>
-      <w:proofErr w:type="spellEnd"/>
-      <w:r>
-        <w:rPr>
-          <w:rFonts w:ascii="Calibri" w:eastAsia="Calibri" w:hAnsi="Calibri" w:cs="Calibri"/>
-          <w:color w:val="222222"/>
-          <w:sz w:val="21"/>
-          <w:szCs w:val="21"/>
-        </w:rPr>
-        <w:t xml:space="preserve"> for configuration management and </w:t>
-      </w:r>
-      <w:proofErr w:type="spellStart"/>
-      <w:r>
-        <w:rPr>
-          <w:rFonts w:ascii="Calibri" w:eastAsia="Calibri" w:hAnsi="Calibri" w:cs="Calibri"/>
-          <w:color w:val="222222"/>
-          <w:sz w:val="21"/>
-          <w:szCs w:val="21"/>
-        </w:rPr>
-        <w:t>Terraform</w:t>
-      </w:r>
-      <w:proofErr w:type="spellEnd"/>
-      <w:r>
-        <w:rPr>
-          <w:rFonts w:ascii="Calibri" w:eastAsia="Calibri" w:hAnsi="Calibri" w:cs="Calibri"/>
-          <w:color w:val="222222"/>
-          <w:sz w:val="21"/>
-          <w:szCs w:val="21"/>
-        </w:rPr>
-        <w:t xml:space="preserve"> for infrastructure provisioning.</w:t>
-      </w:r>
-    </w:p>
-    <w:p>
-      <w:pPr>
-        <w:pStyle w:val="ListParagraph"/>
-        <w:numPr>
-          <w:ilvl w:val="0"/>
-          <w:numId w:val="2"/>
-        </w:numPr>
-        <w:spacing w:after="60"/>
-      </w:pPr>
-      <w:r>
-        <w:rPr>
-          <w:rFonts w:ascii="Calibri" w:eastAsia="Calibri" w:hAnsi="Calibri" w:cs="Calibri"/>
-          <w:color w:val="222222"/>
-          <w:sz w:val="21"/>
-          <w:szCs w:val="21"/>
-        </w:rPr>
-        <w:t xml:space="preserve">Collaborated with the team on version control workflows using </w:t>
-      </w:r>
-      <w:proofErr w:type="spellStart"/>
-      <w:r>
-        <w:rPr>
-          <w:rFonts w:ascii="Calibri" w:eastAsia="Calibri" w:hAnsi="Calibri" w:cs="Calibri"/>
-          <w:color w:val="222222"/>
-          <w:sz w:val="21"/>
-          <w:szCs w:val="21"/>
-        </w:rPr>
-        <w:t>Git</w:t>
-      </w:r>
-      <w:proofErr w:type="spellEnd"/>
-      <w:r>
-        <w:rPr>
-          <w:rFonts w:ascii="Calibri" w:eastAsia="Calibri" w:hAnsi="Calibri" w:cs="Calibri"/>
-          <w:color w:val="222222"/>
-          <w:sz w:val="21"/>
-          <w:szCs w:val="21"/>
-        </w:rPr>
-        <w:t xml:space="preserve"> and </w:t>
-      </w:r>
-      <w:proofErr w:type="spellStart"/>
-      <w:r>
-        <w:rPr>
-          <w:rFonts w:ascii="Calibri" w:eastAsia="Calibri" w:hAnsi="Calibri" w:cs="Calibri"/>
-          <w:color w:val="222222"/>
-          <w:sz w:val="21"/>
-          <w:szCs w:val="21"/>
-        </w:rPr>
-        <w:t>GitHub</w:t>
-      </w:r>
-      <w:proofErr w:type="spellEnd"/>
-      <w:r>
-        <w:rPr>
-          <w:rFonts w:ascii="Calibri" w:eastAsia="Calibri" w:hAnsi="Calibri" w:cs="Calibri"/>
-          <w:color w:val="222222"/>
-          <w:sz w:val="21"/>
-          <w:szCs w:val="21"/>
-        </w:rPr>
-        <w:t>.</w:t>
-      </w:r>
-    </w:p>
-    <w:p>
-      <w:pPr>
-        <w:pBdr>
-          <w:bottom w:val="single" w:sz="6" w:space="2" w:color="1F3864"/>
-        </w:pBdr>
-        <w:spacing w:before="260" w:after="100"/>
-        <w:rPr>
-          <w:rFonts w:ascii="Calibri" w:eastAsia="Calibri" w:hAnsi="Calibri" w:cs="Calibri"/>
-          <w:b/>
-          <w:bCs/>
-          <w:color w:val="1F3864"/>
-          <w:sz w:val="22"/>
-          <w:szCs w:val="22"/>
-        </w:rPr>
-      </w:pPr>
-    </w:p>
-    <w:p>
-      <w:pPr>
-        <w:pBdr>
-          <w:bottom w:val="single" w:sz="6" w:space="2" w:color="1F3864"/>
-        </w:pBdr>
-        <w:spacing w:before="260" w:after="100"/>
-      </w:pPr>
-      <w:r>
-        <w:rPr>
-          <w:rFonts w:ascii="Calibri" w:eastAsia="Calibri" w:hAnsi="Calibri" w:cs="Calibri"/>
-          <w:b/>
-          <w:bCs/>
-          <w:color w:val="1F3864"/>
-          <w:sz w:val="22"/>
-          <w:szCs w:val="22"/>
-        </w:rPr>
-        <w:t>CERTIFICATIONS</w:t>
-      </w:r>
-    </w:p>
-    <w:p>
-      <w:pPr>
-        <w:pStyle w:val="ListParagraph"/>
-        <w:numPr>
-          <w:ilvl w:val="0"/>
-          <w:numId w:val="2"/>
-        </w:numPr>
-        <w:spacing w:after="60"/>
-      </w:pPr>
-      <w:r>
-        <w:rPr>
-          <w:rFonts w:ascii="Calibri" w:eastAsia="Calibri" w:hAnsi="Calibri" w:cs="Calibri"/>
-          <w:color w:val="222222"/>
-          <w:sz w:val="21"/>
-          <w:szCs w:val="21"/>
-        </w:rPr>
-        <w:t>[Add certifications here, e.g., AWS Certified Cloud Practitioner — if any]</w:t>
-      </w:r>
-    </w:p>
-    <w:p>
-      <w:pPr>
-        <w:pBdr>
-          <w:bottom w:val="single" w:sz="6" w:space="2" w:color="1F3864"/>
-        </w:pBdr>
-        <w:spacing w:before="260" w:after="100"/>
-      </w:pPr>
-      <w:r>
-        <w:rPr>
-          <w:rFonts w:ascii="Calibri" w:eastAsia="Calibri" w:hAnsi="Calibri" w:cs="Calibri"/>
-          <w:b/>
-          <w:bCs/>
-          <w:color w:val="1F3864"/>
-          <w:sz w:val="22"/>
-          <w:szCs w:val="22"/>
-        </w:rPr>
-        <w:t>ADDITIONAL INFORMATION</w:t>
-      </w:r>
-    </w:p>
-    <w:p>
-      <w:pPr>
-        <w:pStyle w:val="ListParagraph"/>
-        <w:numPr>
-          <w:ilvl w:val="0"/>
-          <w:numId w:val="2"/>
-        </w:numPr>
-        <w:spacing w:after="60"/>
-      </w:pPr>
-      <w:r>
-        <w:rPr>
-          <w:rFonts w:ascii="Calibri" w:eastAsia="Calibri" w:hAnsi="Calibri" w:cs="Calibri"/>
-          <w:color w:val="222222"/>
-          <w:sz w:val="21"/>
-          <w:szCs w:val="21"/>
-        </w:rPr>
-        <w:t>Languages Known: English, Hindi, Marathi</w:t>
-      </w:r>
-    </w:p>
-    <w:p>
-      <w:pPr>
-        <w:pStyle w:val="ListParagraph"/>
-        <w:numPr>
-          <w:ilvl w:val="0"/>
-          <w:numId w:val="2"/>
-        </w:numPr>
-        <w:spacing w:after="60"/>
-      </w:pPr>
-      <w:r>
-        <w:rPr>
-          <w:rFonts w:ascii="Calibri" w:eastAsia="Calibri" w:hAnsi="Calibri" w:cs="Calibri"/>
-          <w:color w:val="222222"/>
-          <w:sz w:val="21"/>
-          <w:szCs w:val="21"/>
-        </w:rPr>
-        <w:t>Soft Skills: Problem-solving, Team Collaboration, Quick Learner, Communication</w:t>
-      </w:r>
-    </w:p>
-    <w:p>
-      <w:pPr>
-        <w:pStyle w:val="ListParagraph"/>
-        <w:numPr>
-          <w:ilvl w:val="0"/>
-          <w:numId w:val="2"/>
-        </w:numPr>
-        <w:spacing w:after="60"/>
-      </w:pPr>
-      <w:r>
-        <w:rPr>
-          <w:rFonts w:ascii="Calibri" w:eastAsia="Calibri" w:hAnsi="Calibri" w:cs="Calibri"/>
-          <w:color w:val="222222"/>
-          <w:sz w:val="21"/>
-          <w:szCs w:val="21"/>
-        </w:rPr>
-        <w:t>Hobbies/Interests: [e.g., Open-source contribution, Tech blogging]</w:t>
+        <w:rPr>
+          <w:rFonts w:asciiTheme="minorHAnsi" w:hAnsiTheme="minorHAnsi" w:cstheme="minorHAnsi"/>
+        </w:rPr>
+      </w:pPr>
+      <w:r>
+        <w:rPr>
+          <w:rFonts w:asciiTheme="minorHAnsi" w:eastAsia="Calibri" w:hAnsiTheme="minorHAnsi" w:cstheme="minorHAnsi"/>
+          <w:color w:val="222222"/>
+          <w:sz w:val="21"/>
+          <w:szCs w:val="21"/>
+        </w:rPr>
+        <w:t xml:space="preserve">Hobbies/Interests: </w:t>
+      </w:r>
+      <w:r>
+        <w:rPr>
+          <w:rFonts w:asciiTheme="minorHAnsi" w:eastAsia="Calibri" w:hAnsiTheme="minorHAnsi" w:cstheme="minorHAnsi"/>
+          <w:color w:val="222222"/>
+          <w:sz w:val="21"/>
+          <w:szCs w:val="21"/>
+        </w:rPr>
+        <w:t xml:space="preserve"> Open-source contribution</w:t>
       </w:r>
     </w:p>
     <w:sectPr>

</xml_diff>